<commit_message>
Final changes has made
</commit_message>
<xml_diff>
--- a/MegaProject/Automated Test Execution/reports/BCM_Report.docx
+++ b/MegaProject/Automated Test Execution/reports/BCM_Report.docx
@@ -20,12 +20,12 @@
     </w:p>
     <w:p>
       <w:r>
-        <w:t>Total Test Cases : 11</w:t>
+        <w:t>Total Test Cases : 14</w:t>
       </w:r>
     </w:p>
     <w:p>
       <w:r>
-        <w:t>Passed Test Cases : 8</w:t>
+        <w:t>Passed Test Cases : 9</w:t>
       </w:r>
     </w:p>
     <w:p>
@@ -35,12 +35,22 @@
     </w:p>
     <w:p>
       <w:r>
-        <w:t>Pass Percentage : 72.73%</w:t>
+        <w:t>Not Executes Test Cases: 2</w:t>
       </w:r>
     </w:p>
     <w:p>
       <w:r>
-        <w:t>Fail Percentage : 27.27%</w:t>
+        <w:t>Pass Percentage : 64.29%</w:t>
+      </w:r>
+    </w:p>
+    <w:p>
+      <w:r>
+        <w:t>Fail Percentage : 21.43%</w:t>
+      </w:r>
+    </w:p>
+    <w:p>
+      <w:r>
+        <w:t>Not_Executes_test_cases: 14.29%</w:t>
       </w:r>
     </w:p>
     <w:p>
@@ -102,17 +112,19 @@
         <w:tblLook w:firstColumn="1" w:firstRow="1" w:lastColumn="0" w:lastRow="0" w:noHBand="0" w:noVBand="1" w:val="04A0"/>
       </w:tblPr>
       <w:tblGrid>
-        <w:gridCol w:w="1440"/>
-        <w:gridCol w:w="1440"/>
-        <w:gridCol w:w="1440"/>
-        <w:gridCol w:w="1440"/>
-        <w:gridCol w:w="1440"/>
-        <w:gridCol w:w="1440"/>
+        <w:gridCol w:w="1080"/>
+        <w:gridCol w:w="1080"/>
+        <w:gridCol w:w="1080"/>
+        <w:gridCol w:w="1080"/>
+        <w:gridCol w:w="1080"/>
+        <w:gridCol w:w="1080"/>
+        <w:gridCol w:w="1080"/>
+        <w:gridCol w:w="1080"/>
       </w:tblGrid>
       <w:tr>
         <w:tc>
           <w:tcPr>
-            <w:tcW w:type="dxa" w:w="1440"/>
+            <w:tcW w:type="dxa" w:w="1080"/>
           </w:tcPr>
           <w:p>
             <w:r>
@@ -122,7 +134,7 @@
         </w:tc>
         <w:tc>
           <w:tcPr>
-            <w:tcW w:type="dxa" w:w="1440"/>
+            <w:tcW w:type="dxa" w:w="1080"/>
           </w:tcPr>
           <w:p>
             <w:r>
@@ -132,7 +144,27 @@
         </w:tc>
         <w:tc>
           <w:tcPr>
-            <w:tcW w:type="dxa" w:w="1440"/>
+            <w:tcW w:type="dxa" w:w="1080"/>
+          </w:tcPr>
+          <w:p>
+            <w:r>
+              <w:t>Engine Status</w:t>
+            </w:r>
+          </w:p>
+        </w:tc>
+        <w:tc>
+          <w:tcPr>
+            <w:tcW w:type="dxa" w:w="1080"/>
+          </w:tcPr>
+          <w:p>
+            <w:r>
+              <w:t>Speed</w:t>
+            </w:r>
+          </w:p>
+        </w:tc>
+        <w:tc>
+          <w:tcPr>
+            <w:tcW w:type="dxa" w:w="1080"/>
           </w:tcPr>
           <w:p>
             <w:r>
@@ -142,7 +174,7 @@
         </w:tc>
         <w:tc>
           <w:tcPr>
-            <w:tcW w:type="dxa" w:w="1440"/>
+            <w:tcW w:type="dxa" w:w="1080"/>
           </w:tcPr>
           <w:p>
             <w:r>
@@ -152,7 +184,7 @@
         </w:tc>
         <w:tc>
           <w:tcPr>
-            <w:tcW w:type="dxa" w:w="1440"/>
+            <w:tcW w:type="dxa" w:w="1080"/>
           </w:tcPr>
           <w:p>
             <w:r>
@@ -162,7 +194,7 @@
         </w:tc>
         <w:tc>
           <w:tcPr>
-            <w:tcW w:type="dxa" w:w="1440"/>
+            <w:tcW w:type="dxa" w:w="1080"/>
           </w:tcPr>
           <w:p>
             <w:r>
@@ -174,7 +206,7 @@
       <w:tr>
         <w:tc>
           <w:tcPr>
-            <w:tcW w:type="dxa" w:w="1440"/>
+            <w:tcW w:type="dxa" w:w="1080"/>
           </w:tcPr>
           <w:p>
             <w:r>
@@ -184,17 +216,37 @@
         </w:tc>
         <w:tc>
           <w:tcPr>
-            <w:tcW w:type="dxa" w:w="1440"/>
+            <w:tcW w:type="dxa" w:w="1080"/>
           </w:tcPr>
           <w:p>
             <w:r>
-              <w:t>Lock door using key fob</w:t>
+              <w:t>Verify that all vehicle doors are locked successfully when the Lock button on the key fob is pressed</w:t>
             </w:r>
           </w:p>
         </w:tc>
         <w:tc>
           <w:tcPr>
-            <w:tcW w:type="dxa" w:w="1440"/>
+            <w:tcW w:type="dxa" w:w="1080"/>
+          </w:tcPr>
+          <w:p>
+            <w:r>
+              <w:t>OFF</w:t>
+            </w:r>
+          </w:p>
+        </w:tc>
+        <w:tc>
+          <w:tcPr>
+            <w:tcW w:type="dxa" w:w="1080"/>
+          </w:tcPr>
+          <w:p>
+            <w:r>
+              <w:t>0</w:t>
+            </w:r>
+          </w:p>
+        </w:tc>
+        <w:tc>
+          <w:tcPr>
+            <w:tcW w:type="dxa" w:w="1080"/>
           </w:tcPr>
           <w:p>
             <w:r>
@@ -204,7 +256,7 @@
         </w:tc>
         <w:tc>
           <w:tcPr>
-            <w:tcW w:type="dxa" w:w="1440"/>
+            <w:tcW w:type="dxa" w:w="1080"/>
           </w:tcPr>
           <w:p>
             <w:r>
@@ -214,7 +266,7 @@
         </w:tc>
         <w:tc>
           <w:tcPr>
-            <w:tcW w:type="dxa" w:w="1440"/>
+            <w:tcW w:type="dxa" w:w="1080"/>
           </w:tcPr>
           <w:p>
             <w:r>
@@ -224,7 +276,7 @@
         </w:tc>
         <w:tc>
           <w:tcPr>
-            <w:tcW w:type="dxa" w:w="1440"/>
+            <w:tcW w:type="dxa" w:w="1080"/>
           </w:tcPr>
           <w:p>
             <w:r>
@@ -236,7 +288,7 @@
       <w:tr>
         <w:tc>
           <w:tcPr>
-            <w:tcW w:type="dxa" w:w="1440"/>
+            <w:tcW w:type="dxa" w:w="1080"/>
           </w:tcPr>
           <w:p>
             <w:r>
@@ -246,17 +298,37 @@
         </w:tc>
         <w:tc>
           <w:tcPr>
-            <w:tcW w:type="dxa" w:w="1440"/>
+            <w:tcW w:type="dxa" w:w="1080"/>
           </w:tcPr>
           <w:p>
             <w:r>
-              <w:t>Unlock door using key fob</w:t>
+              <w:t xml:space="preserve">Verify that all vehicle doors are unlocked successfully when the Unlock button on the key fob is pressed </w:t>
             </w:r>
           </w:p>
         </w:tc>
         <w:tc>
           <w:tcPr>
-            <w:tcW w:type="dxa" w:w="1440"/>
+            <w:tcW w:type="dxa" w:w="1080"/>
+          </w:tcPr>
+          <w:p>
+            <w:r>
+              <w:t>OFF</w:t>
+            </w:r>
+          </w:p>
+        </w:tc>
+        <w:tc>
+          <w:tcPr>
+            <w:tcW w:type="dxa" w:w="1080"/>
+          </w:tcPr>
+          <w:p>
+            <w:r>
+              <w:t>0</w:t>
+            </w:r>
+          </w:p>
+        </w:tc>
+        <w:tc>
+          <w:tcPr>
+            <w:tcW w:type="dxa" w:w="1080"/>
           </w:tcPr>
           <w:p>
             <w:r>
@@ -266,7 +338,7 @@
         </w:tc>
         <w:tc>
           <w:tcPr>
-            <w:tcW w:type="dxa" w:w="1440"/>
+            <w:tcW w:type="dxa" w:w="1080"/>
           </w:tcPr>
           <w:p>
             <w:r>
@@ -276,7 +348,7 @@
         </w:tc>
         <w:tc>
           <w:tcPr>
-            <w:tcW w:type="dxa" w:w="1440"/>
+            <w:tcW w:type="dxa" w:w="1080"/>
           </w:tcPr>
           <w:p>
             <w:r>
@@ -286,7 +358,7 @@
         </w:tc>
         <w:tc>
           <w:tcPr>
-            <w:tcW w:type="dxa" w:w="1440"/>
+            <w:tcW w:type="dxa" w:w="1080"/>
           </w:tcPr>
           <w:p>
             <w:r>
@@ -298,7 +370,7 @@
       <w:tr>
         <w:tc>
           <w:tcPr>
-            <w:tcW w:type="dxa" w:w="1440"/>
+            <w:tcW w:type="dxa" w:w="1080"/>
           </w:tcPr>
           <w:p>
             <w:r>
@@ -308,17 +380,37 @@
         </w:tc>
         <w:tc>
           <w:tcPr>
-            <w:tcW w:type="dxa" w:w="1440"/>
+            <w:tcW w:type="dxa" w:w="1080"/>
           </w:tcPr>
           <w:p>
             <w:r>
-              <w:t>Verify unlock is allowed at low speed value&lt;10</w:t>
+              <w:t>Verify that door unlock operation is allowed using the central unlocking switch when vehicle speed is below 10 km/h</w:t>
             </w:r>
           </w:p>
         </w:tc>
         <w:tc>
           <w:tcPr>
-            <w:tcW w:type="dxa" w:w="1440"/>
+            <w:tcW w:type="dxa" w:w="1080"/>
+          </w:tcPr>
+          <w:p>
+            <w:r>
+              <w:t>ON</w:t>
+            </w:r>
+          </w:p>
+        </w:tc>
+        <w:tc>
+          <w:tcPr>
+            <w:tcW w:type="dxa" w:w="1080"/>
+          </w:tcPr>
+          <w:p>
+            <w:r>
+              <w:t>30</w:t>
+            </w:r>
+          </w:p>
+        </w:tc>
+        <w:tc>
+          <w:tcPr>
+            <w:tcW w:type="dxa" w:w="1080"/>
           </w:tcPr>
           <w:p>
             <w:r>
@@ -328,7 +420,79 @@
         </w:tc>
         <w:tc>
           <w:tcPr>
-            <w:tcW w:type="dxa" w:w="1440"/>
+            <w:tcW w:type="dxa" w:w="1080"/>
+          </w:tcPr>
+          <w:p>
+            <w:r>
+              <w:t>Door Locked</w:t>
+            </w:r>
+          </w:p>
+        </w:tc>
+        <w:tc>
+          <w:tcPr>
+            <w:tcW w:type="dxa" w:w="1080"/>
+          </w:tcPr>
+          <w:p>
+            <w:r>
+              <w:t>Pass</w:t>
+            </w:r>
+          </w:p>
+        </w:tc>
+        <w:tc>
+          <w:tcPr>
+            <w:tcW w:type="dxa" w:w="1080"/>
+          </w:tcPr>
+          <w:p>
+            <w:r>
+              <w:t>Vehicle Speed Above Limit</w:t>
+            </w:r>
+          </w:p>
+        </w:tc>
+      </w:tr>
+      <w:tr>
+        <w:tc>
+          <w:tcPr>
+            <w:tcW w:type="dxa" w:w="1080"/>
+          </w:tcPr>
+          <w:p>
+            <w:r>
+              <w:t>TC04</w:t>
+            </w:r>
+          </w:p>
+        </w:tc>
+        <w:tc>
+          <w:tcPr>
+            <w:tcW w:type="dxa" w:w="1080"/>
+          </w:tcPr>
+          <w:p>
+            <w:r>
+              <w:t xml:space="preserve">Verify that door unlock operation is blocked using the central unlocking switch when vehicle speed exceeds 10 km/h </w:t>
+            </w:r>
+          </w:p>
+        </w:tc>
+        <w:tc>
+          <w:tcPr>
+            <w:tcW w:type="dxa" w:w="1080"/>
+          </w:tcPr>
+          <w:p>
+            <w:r>
+              <w:t>ON</w:t>
+            </w:r>
+          </w:p>
+        </w:tc>
+        <w:tc>
+          <w:tcPr>
+            <w:tcW w:type="dxa" w:w="1080"/>
+          </w:tcPr>
+          <w:p>
+            <w:r>
+              <w:t>9</w:t>
+            </w:r>
+          </w:p>
+        </w:tc>
+        <w:tc>
+          <w:tcPr>
+            <w:tcW w:type="dxa" w:w="1080"/>
           </w:tcPr>
           <w:p>
             <w:r>
@@ -338,17 +502,27 @@
         </w:tc>
         <w:tc>
           <w:tcPr>
-            <w:tcW w:type="dxa" w:w="1440"/>
+            <w:tcW w:type="dxa" w:w="1080"/>
           </w:tcPr>
           <w:p>
             <w:r>
-              <w:t>Fail</w:t>
+              <w:t>Door Unlocked</w:t>
             </w:r>
           </w:p>
         </w:tc>
         <w:tc>
           <w:tcPr>
-            <w:tcW w:type="dxa" w:w="1440"/>
+            <w:tcW w:type="dxa" w:w="1080"/>
+          </w:tcPr>
+          <w:p>
+            <w:r>
+              <w:t>Pass</w:t>
+            </w:r>
+          </w:p>
+        </w:tc>
+        <w:tc>
+          <w:tcPr>
+            <w:tcW w:type="dxa" w:w="1080"/>
           </w:tcPr>
           <w:p>
             <w:r>
@@ -360,27 +534,47 @@
       <w:tr>
         <w:tc>
           <w:tcPr>
-            <w:tcW w:type="dxa" w:w="1440"/>
+            <w:tcW w:type="dxa" w:w="1080"/>
           </w:tcPr>
           <w:p>
             <w:r>
-              <w:t>TC04</w:t>
+              <w:t>TC05</w:t>
             </w:r>
           </w:p>
         </w:tc>
         <w:tc>
           <w:tcPr>
-            <w:tcW w:type="dxa" w:w="1440"/>
+            <w:tcW w:type="dxa" w:w="1080"/>
           </w:tcPr>
           <w:p>
             <w:r>
-              <w:t>Verify unlock is blocked above speed limit&gt;10</w:t>
+              <w:t xml:space="preserve">Verify that central unlock request is allowed or not at the vehicle speed of 60 km/h </w:t>
             </w:r>
           </w:p>
         </w:tc>
         <w:tc>
           <w:tcPr>
-            <w:tcW w:type="dxa" w:w="1440"/>
+            <w:tcW w:type="dxa" w:w="1080"/>
+          </w:tcPr>
+          <w:p>
+            <w:r>
+              <w:t>ON</w:t>
+            </w:r>
+          </w:p>
+        </w:tc>
+        <w:tc>
+          <w:tcPr>
+            <w:tcW w:type="dxa" w:w="1080"/>
+          </w:tcPr>
+          <w:p>
+            <w:r>
+              <w:t>60</w:t>
+            </w:r>
+          </w:p>
+        </w:tc>
+        <w:tc>
+          <w:tcPr>
+            <w:tcW w:type="dxa" w:w="1080"/>
           </w:tcPr>
           <w:p>
             <w:r>
@@ -390,7 +584,7 @@
         </w:tc>
         <w:tc>
           <w:tcPr>
-            <w:tcW w:type="dxa" w:w="1440"/>
+            <w:tcW w:type="dxa" w:w="1080"/>
           </w:tcPr>
           <w:p>
             <w:r>
@@ -400,7 +594,7 @@
         </w:tc>
         <w:tc>
           <w:tcPr>
-            <w:tcW w:type="dxa" w:w="1440"/>
+            <w:tcW w:type="dxa" w:w="1080"/>
           </w:tcPr>
           <w:p>
             <w:r>
@@ -410,11 +604,11 @@
         </w:tc>
         <w:tc>
           <w:tcPr>
-            <w:tcW w:type="dxa" w:w="1440"/>
+            <w:tcW w:type="dxa" w:w="1080"/>
           </w:tcPr>
           <w:p>
             <w:r>
-              <w:t>Rear Right Door Open, Vehicle Speed Above Limit</w:t>
+              <w:t>Driver Door Open, Rear Left Door Open, Vehicle Speed Above Limit</w:t>
             </w:r>
           </w:p>
         </w:tc>
@@ -422,27 +616,57 @@
       <w:tr>
         <w:tc>
           <w:tcPr>
-            <w:tcW w:type="dxa" w:w="1440"/>
+            <w:tcW w:type="dxa" w:w="1080"/>
           </w:tcPr>
           <w:p>
             <w:r>
-              <w:t>TC05</w:t>
+              <w:t>TC06</w:t>
             </w:r>
           </w:p>
         </w:tc>
         <w:tc>
           <w:tcPr>
-            <w:tcW w:type="dxa" w:w="1440"/>
+            <w:tcW w:type="dxa" w:w="1080"/>
           </w:tcPr>
           <w:p>
             <w:r>
-              <w:t>Verify unlock at boundary value 60 km/h</w:t>
+              <w:t>Verify that automatic door locking is activated when vehicle speed exceeds 20 km/h</w:t>
             </w:r>
           </w:p>
         </w:tc>
         <w:tc>
           <w:tcPr>
-            <w:tcW w:type="dxa" w:w="1440"/>
+            <w:tcW w:type="dxa" w:w="1080"/>
+          </w:tcPr>
+          <w:p>
+            <w:r>
+              <w:t>ON</w:t>
+            </w:r>
+          </w:p>
+        </w:tc>
+        <w:tc>
+          <w:tcPr>
+            <w:tcW w:type="dxa" w:w="1080"/>
+          </w:tcPr>
+          <w:p>
+            <w:r>
+              <w:t>15</w:t>
+            </w:r>
+          </w:p>
+        </w:tc>
+        <w:tc>
+          <w:tcPr>
+            <w:tcW w:type="dxa" w:w="1080"/>
+          </w:tcPr>
+          <w:p>
+            <w:r>
+              <w:t>Door Locked</w:t>
+            </w:r>
+          </w:p>
+        </w:tc>
+        <w:tc>
+          <w:tcPr>
+            <w:tcW w:type="dxa" w:w="1080"/>
           </w:tcPr>
           <w:p>
             <w:r>
@@ -452,7 +676,151 @@
         </w:tc>
         <w:tc>
           <w:tcPr>
-            <w:tcW w:type="dxa" w:w="1440"/>
+            <w:tcW w:type="dxa" w:w="1080"/>
+          </w:tcPr>
+          <w:p>
+            <w:r>
+              <w:t>Fail</w:t>
+            </w:r>
+          </w:p>
+        </w:tc>
+        <w:tc>
+          <w:tcPr>
+            <w:tcW w:type="dxa" w:w="1080"/>
+          </w:tcPr>
+          <w:p>
+            <w:r>
+              <w:t>Speed Below Auto Lock Threshold</w:t>
+            </w:r>
+          </w:p>
+        </w:tc>
+      </w:tr>
+      <w:tr>
+        <w:tc>
+          <w:tcPr>
+            <w:tcW w:type="dxa" w:w="1080"/>
+          </w:tcPr>
+          <w:p>
+            <w:r>
+              <w:t>TC06</w:t>
+            </w:r>
+          </w:p>
+        </w:tc>
+        <w:tc>
+          <w:tcPr>
+            <w:tcW w:type="dxa" w:w="1080"/>
+          </w:tcPr>
+          <w:p>
+            <w:r>
+              <w:t>Verify that automatic door locking is activated when vehicle speed exceeds 20 km/h</w:t>
+            </w:r>
+          </w:p>
+        </w:tc>
+        <w:tc>
+          <w:tcPr>
+            <w:tcW w:type="dxa" w:w="1080"/>
+          </w:tcPr>
+          <w:p>
+            <w:r>
+              <w:t>ON</w:t>
+            </w:r>
+          </w:p>
+        </w:tc>
+        <w:tc>
+          <w:tcPr>
+            <w:tcW w:type="dxa" w:w="1080"/>
+          </w:tcPr>
+          <w:p>
+            <w:r>
+              <w:t>25</w:t>
+            </w:r>
+          </w:p>
+        </w:tc>
+        <w:tc>
+          <w:tcPr>
+            <w:tcW w:type="dxa" w:w="1080"/>
+          </w:tcPr>
+          <w:p>
+            <w:r>
+              <w:t>Door Locked</w:t>
+            </w:r>
+          </w:p>
+        </w:tc>
+        <w:tc>
+          <w:tcPr>
+            <w:tcW w:type="dxa" w:w="1080"/>
+          </w:tcPr>
+          <w:p>
+            <w:r>
+              <w:t>Not Executed</w:t>
+            </w:r>
+          </w:p>
+        </w:tc>
+        <w:tc>
+          <w:tcPr>
+            <w:tcW w:type="dxa" w:w="1080"/>
+          </w:tcPr>
+          <w:p>
+            <w:r>
+              <w:t>Not Executed</w:t>
+            </w:r>
+          </w:p>
+        </w:tc>
+        <w:tc>
+          <w:tcPr>
+            <w:tcW w:type="dxa" w:w="1080"/>
+          </w:tcPr>
+          <w:p>
+            <w:r>
+              <w:t>One or more mandatory fields are blank.</w:t>
+            </w:r>
+          </w:p>
+        </w:tc>
+      </w:tr>
+      <w:tr>
+        <w:tc>
+          <w:tcPr>
+            <w:tcW w:type="dxa" w:w="1080"/>
+          </w:tcPr>
+          <w:p>
+            <w:r>
+              <w:t>TC07</w:t>
+            </w:r>
+          </w:p>
+        </w:tc>
+        <w:tc>
+          <w:tcPr>
+            <w:tcW w:type="dxa" w:w="1080"/>
+          </w:tcPr>
+          <w:p>
+            <w:r>
+              <w:t>Verify that key fob lock request is rejected when the driver door is open</w:t>
+            </w:r>
+          </w:p>
+        </w:tc>
+        <w:tc>
+          <w:tcPr>
+            <w:tcW w:type="dxa" w:w="1080"/>
+          </w:tcPr>
+          <w:p>
+            <w:r>
+              <w:t>ON</w:t>
+            </w:r>
+          </w:p>
+        </w:tc>
+        <w:tc>
+          <w:tcPr>
+            <w:tcW w:type="dxa" w:w="1080"/>
+          </w:tcPr>
+          <w:p>
+            <w:r>
+              <w:t>15</w:t>
+            </w:r>
+          </w:p>
+        </w:tc>
+        <w:tc>
+          <w:tcPr>
+            <w:tcW w:type="dxa" w:w="1080"/>
           </w:tcPr>
           <w:p>
             <w:r>
@@ -462,7 +830,17 @@
         </w:tc>
         <w:tc>
           <w:tcPr>
-            <w:tcW w:type="dxa" w:w="1440"/>
+            <w:tcW w:type="dxa" w:w="1080"/>
+          </w:tcPr>
+          <w:p>
+            <w:r>
+              <w:t>Door Unlocked</w:t>
+            </w:r>
+          </w:p>
+        </w:tc>
+        <w:tc>
+          <w:tcPr>
+            <w:tcW w:type="dxa" w:w="1080"/>
           </w:tcPr>
           <w:p>
             <w:r>
@@ -472,193 +850,7 @@
         </w:tc>
         <w:tc>
           <w:tcPr>
-            <w:tcW w:type="dxa" w:w="1440"/>
-          </w:tcPr>
-          <w:p>
-            <w:r>
-              <w:t>Driver Door Open, Rear Left Door Open, Unlock Allowed</w:t>
-            </w:r>
-          </w:p>
-        </w:tc>
-      </w:tr>
-      <w:tr>
-        <w:tc>
-          <w:tcPr>
-            <w:tcW w:type="dxa" w:w="1440"/>
-          </w:tcPr>
-          <w:p>
-            <w:r>
-              <w:t>TC06</w:t>
-            </w:r>
-          </w:p>
-        </w:tc>
-        <w:tc>
-          <w:tcPr>
-            <w:tcW w:type="dxa" w:w="1440"/>
-          </w:tcPr>
-          <w:p>
-            <w:r>
-              <w:t>Verify auto-lock activates above 20 km/h</w:t>
-            </w:r>
-          </w:p>
-        </w:tc>
-        <w:tc>
-          <w:tcPr>
-            <w:tcW w:type="dxa" w:w="1440"/>
-          </w:tcPr>
-          <w:p>
-            <w:r>
-              <w:t>Door Locked</w:t>
-            </w:r>
-          </w:p>
-        </w:tc>
-        <w:tc>
-          <w:tcPr>
-            <w:tcW w:type="dxa" w:w="1440"/>
-          </w:tcPr>
-          <w:p>
-            <w:r>
-              <w:t>Door Locked</w:t>
-            </w:r>
-          </w:p>
-        </w:tc>
-        <w:tc>
-          <w:tcPr>
-            <w:tcW w:type="dxa" w:w="1440"/>
-          </w:tcPr>
-          <w:p>
-            <w:r>
-              <w:t>Pass</w:t>
-            </w:r>
-          </w:p>
-        </w:tc>
-        <w:tc>
-          <w:tcPr>
-            <w:tcW w:type="dxa" w:w="1440"/>
-          </w:tcPr>
-          <w:p>
-            <w:r>
-              <w:t>Auto Lock Activated</w:t>
-            </w:r>
-          </w:p>
-        </w:tc>
-      </w:tr>
-      <w:tr>
-        <w:tc>
-          <w:tcPr>
-            <w:tcW w:type="dxa" w:w="1440"/>
-          </w:tcPr>
-          <w:p>
-            <w:r>
-              <w:t>TC07</w:t>
-            </w:r>
-          </w:p>
-        </w:tc>
-        <w:tc>
-          <w:tcPr>
-            <w:tcW w:type="dxa" w:w="1440"/>
-          </w:tcPr>
-          <w:p>
-            <w:r>
-              <w:t>Verify auto-lock does not activate below threshold(20)</w:t>
-            </w:r>
-          </w:p>
-        </w:tc>
-        <w:tc>
-          <w:tcPr>
-            <w:tcW w:type="dxa" w:w="1440"/>
-          </w:tcPr>
-          <w:p>
-            <w:r>
-              <w:t>Door Unlocked</w:t>
-            </w:r>
-          </w:p>
-        </w:tc>
-        <w:tc>
-          <w:tcPr>
-            <w:tcW w:type="dxa" w:w="1440"/>
-          </w:tcPr>
-          <w:p>
-            <w:r>
-              <w:t>Door Unlocked</w:t>
-            </w:r>
-          </w:p>
-        </w:tc>
-        <w:tc>
-          <w:tcPr>
-            <w:tcW w:type="dxa" w:w="1440"/>
-          </w:tcPr>
-          <w:p>
-            <w:r>
-              <w:t>Pass</w:t>
-            </w:r>
-          </w:p>
-        </w:tc>
-        <w:tc>
-          <w:tcPr>
-            <w:tcW w:type="dxa" w:w="1440"/>
-          </w:tcPr>
-          <w:p>
-            <w:r>
-              <w:t>Rear Right Door Open, Speed Below Auto Lock Threshold</w:t>
-            </w:r>
-          </w:p>
-        </w:tc>
-      </w:tr>
-      <w:tr>
-        <w:tc>
-          <w:tcPr>
-            <w:tcW w:type="dxa" w:w="1440"/>
-          </w:tcPr>
-          <w:p>
-            <w:r>
-              <w:t>TC08</w:t>
-            </w:r>
-          </w:p>
-        </w:tc>
-        <w:tc>
-          <w:tcPr>
-            <w:tcW w:type="dxa" w:w="1440"/>
-          </w:tcPr>
-          <w:p>
-            <w:r>
-              <w:t>Verify lock command when driver door is open</w:t>
-            </w:r>
-          </w:p>
-        </w:tc>
-        <w:tc>
-          <w:tcPr>
-            <w:tcW w:type="dxa" w:w="1440"/>
-          </w:tcPr>
-          <w:p>
-            <w:r>
-              <w:t>Door Unlocked</w:t>
-            </w:r>
-          </w:p>
-        </w:tc>
-        <w:tc>
-          <w:tcPr>
-            <w:tcW w:type="dxa" w:w="1440"/>
-          </w:tcPr>
-          <w:p>
-            <w:r>
-              <w:t>Door Unlocked</w:t>
-            </w:r>
-          </w:p>
-        </w:tc>
-        <w:tc>
-          <w:tcPr>
-            <w:tcW w:type="dxa" w:w="1440"/>
-          </w:tcPr>
-          <w:p>
-            <w:r>
-              <w:t>Pass</w:t>
-            </w:r>
-          </w:p>
-        </w:tc>
-        <w:tc>
-          <w:tcPr>
-            <w:tcW w:type="dxa" w:w="1440"/>
+            <w:tcW w:type="dxa" w:w="1080"/>
           </w:tcPr>
           <w:p>
             <w:r>
@@ -670,7 +862,89 @@
       <w:tr>
         <w:tc>
           <w:tcPr>
-            <w:tcW w:type="dxa" w:w="1440"/>
+            <w:tcW w:type="dxa" w:w="1080"/>
+          </w:tcPr>
+          <w:p>
+            <w:r>
+              <w:t>TC08</w:t>
+            </w:r>
+          </w:p>
+        </w:tc>
+        <w:tc>
+          <w:tcPr>
+            <w:tcW w:type="dxa" w:w="1080"/>
+          </w:tcPr>
+          <w:p>
+            <w:r>
+              <w:t>Verify that all vehicle doors are locked successfully using the central locking switch</w:t>
+            </w:r>
+          </w:p>
+        </w:tc>
+        <w:tc>
+          <w:tcPr>
+            <w:tcW w:type="dxa" w:w="1080"/>
+          </w:tcPr>
+          <w:p>
+            <w:r>
+              <w:t>OFF</w:t>
+            </w:r>
+          </w:p>
+        </w:tc>
+        <w:tc>
+          <w:tcPr>
+            <w:tcW w:type="dxa" w:w="1080"/>
+          </w:tcPr>
+          <w:p>
+            <w:r>
+              <w:t>0</w:t>
+            </w:r>
+          </w:p>
+        </w:tc>
+        <w:tc>
+          <w:tcPr>
+            <w:tcW w:type="dxa" w:w="1080"/>
+          </w:tcPr>
+          <w:p>
+            <w:r>
+              <w:t>Door Locked</w:t>
+            </w:r>
+          </w:p>
+        </w:tc>
+        <w:tc>
+          <w:tcPr>
+            <w:tcW w:type="dxa" w:w="1080"/>
+          </w:tcPr>
+          <w:p>
+            <w:r>
+              <w:t>Door Unlocked</w:t>
+            </w:r>
+          </w:p>
+        </w:tc>
+        <w:tc>
+          <w:tcPr>
+            <w:tcW w:type="dxa" w:w="1080"/>
+          </w:tcPr>
+          <w:p>
+            <w:r>
+              <w:t>Fail</w:t>
+            </w:r>
+          </w:p>
+        </w:tc>
+        <w:tc>
+          <w:tcPr>
+            <w:tcW w:type="dxa" w:w="1080"/>
+          </w:tcPr>
+          <w:p>
+            <w:r>
+              <w:t>Driver Door Open, Central Lock Failed</w:t>
+            </w:r>
+          </w:p>
+        </w:tc>
+      </w:tr>
+      <w:tr>
+        <w:tc>
+          <w:tcPr>
+            <w:tcW w:type="dxa" w:w="1080"/>
           </w:tcPr>
           <w:p>
             <w:r>
@@ -680,17 +954,201 @@
         </w:tc>
         <w:tc>
           <w:tcPr>
-            <w:tcW w:type="dxa" w:w="1440"/>
+            <w:tcW w:type="dxa" w:w="1080"/>
           </w:tcPr>
           <w:p>
             <w:r>
-              <w:t>Verify central lock request</w:t>
+              <w:t>Verify that all vehicle doors are unlocked successfully using the central unlocking switch</w:t>
             </w:r>
           </w:p>
         </w:tc>
         <w:tc>
           <w:tcPr>
-            <w:tcW w:type="dxa" w:w="1440"/>
+            <w:tcW w:type="dxa" w:w="1080"/>
+          </w:tcPr>
+          <w:p>
+            <w:r>
+              <w:t>OFF</w:t>
+            </w:r>
+          </w:p>
+        </w:tc>
+        <w:tc>
+          <w:tcPr>
+            <w:tcW w:type="dxa" w:w="1080"/>
+          </w:tcPr>
+          <w:p>
+            <w:r>
+              <w:t>0</w:t>
+            </w:r>
+          </w:p>
+        </w:tc>
+        <w:tc>
+          <w:tcPr>
+            <w:tcW w:type="dxa" w:w="1080"/>
+          </w:tcPr>
+          <w:p>
+            <w:r>
+              <w:t>Door Unlocked</w:t>
+            </w:r>
+          </w:p>
+        </w:tc>
+        <w:tc>
+          <w:tcPr>
+            <w:tcW w:type="dxa" w:w="1080"/>
+          </w:tcPr>
+          <w:p>
+            <w:r>
+              <w:t>Door Unlocked</w:t>
+            </w:r>
+          </w:p>
+        </w:tc>
+        <w:tc>
+          <w:tcPr>
+            <w:tcW w:type="dxa" w:w="1080"/>
+          </w:tcPr>
+          <w:p>
+            <w:r>
+              <w:t>Pass</w:t>
+            </w:r>
+          </w:p>
+        </w:tc>
+        <w:tc>
+          <w:tcPr>
+            <w:tcW w:type="dxa" w:w="1080"/>
+          </w:tcPr>
+          <w:p>
+            <w:r>
+              <w:t>Rear Right Door Open, Unlock Allowed</w:t>
+            </w:r>
+          </w:p>
+        </w:tc>
+      </w:tr>
+      <w:tr>
+        <w:tc>
+          <w:tcPr>
+            <w:tcW w:type="dxa" w:w="1080"/>
+          </w:tcPr>
+          <w:p>
+            <w:r>
+              <w:t>TC10</w:t>
+            </w:r>
+          </w:p>
+        </w:tc>
+        <w:tc>
+          <w:tcPr>
+            <w:tcW w:type="dxa" w:w="1080"/>
+          </w:tcPr>
+          <w:p>
+            <w:r>
+              <w:t xml:space="preserve">Verify that lock request through the key fob is rejected when the boot door is open and the vehicle is parked </w:t>
+            </w:r>
+          </w:p>
+        </w:tc>
+        <w:tc>
+          <w:tcPr>
+            <w:tcW w:type="dxa" w:w="1080"/>
+          </w:tcPr>
+          <w:p>
+            <w:r>
+              <w:t>OFF</w:t>
+            </w:r>
+          </w:p>
+        </w:tc>
+        <w:tc>
+          <w:tcPr>
+            <w:tcW w:type="dxa" w:w="1080"/>
+          </w:tcPr>
+          <w:p>
+            <w:r>
+              <w:t>0</w:t>
+            </w:r>
+          </w:p>
+        </w:tc>
+        <w:tc>
+          <w:tcPr>
+            <w:tcW w:type="dxa" w:w="1080"/>
+          </w:tcPr>
+          <w:p>
+            <w:r>
+              <w:t>Door Unlocked</w:t>
+            </w:r>
+          </w:p>
+        </w:tc>
+        <w:tc>
+          <w:tcPr>
+            <w:tcW w:type="dxa" w:w="1080"/>
+          </w:tcPr>
+          <w:p>
+            <w:r>
+              <w:t>Door Unlocked</w:t>
+            </w:r>
+          </w:p>
+        </w:tc>
+        <w:tc>
+          <w:tcPr>
+            <w:tcW w:type="dxa" w:w="1080"/>
+          </w:tcPr>
+          <w:p>
+            <w:r>
+              <w:t>Pass</w:t>
+            </w:r>
+          </w:p>
+        </w:tc>
+        <w:tc>
+          <w:tcPr>
+            <w:tcW w:type="dxa" w:w="1080"/>
+          </w:tcPr>
+          <w:p>
+            <w:r>
+              <w:t>Boot Door Open, Lock Failed</w:t>
+            </w:r>
+          </w:p>
+        </w:tc>
+      </w:tr>
+      <w:tr>
+        <w:tc>
+          <w:tcPr>
+            <w:tcW w:type="dxa" w:w="1080"/>
+          </w:tcPr>
+          <w:p>
+            <w:r>
+              <w:t>TC11</w:t>
+            </w:r>
+          </w:p>
+        </w:tc>
+        <w:tc>
+          <w:tcPr>
+            <w:tcW w:type="dxa" w:w="1080"/>
+          </w:tcPr>
+          <w:p>
+            <w:r>
+              <w:t>Verify lock request when some fields are missing</w:t>
+            </w:r>
+          </w:p>
+        </w:tc>
+        <w:tc>
+          <w:tcPr>
+            <w:tcW w:type="dxa" w:w="1080"/>
+          </w:tcPr>
+          <w:p>
+            <w:r>
+              <w:t>OFF</w:t>
+            </w:r>
+          </w:p>
+        </w:tc>
+        <w:tc>
+          <w:tcPr>
+            <w:tcW w:type="dxa" w:w="1080"/>
+          </w:tcPr>
+          <w:p>
+            <w:r>
+              <w:t>0</w:t>
+            </w:r>
+          </w:p>
+        </w:tc>
+        <w:tc>
+          <w:tcPr>
+            <w:tcW w:type="dxa" w:w="1080"/>
           </w:tcPr>
           <w:p>
             <w:r>
@@ -700,7 +1158,161 @@
         </w:tc>
         <w:tc>
           <w:tcPr>
-            <w:tcW w:type="dxa" w:w="1440"/>
+            <w:tcW w:type="dxa" w:w="1080"/>
+          </w:tcPr>
+          <w:p>
+            <w:r>
+              <w:t>Not Executed</w:t>
+            </w:r>
+          </w:p>
+        </w:tc>
+        <w:tc>
+          <w:tcPr>
+            <w:tcW w:type="dxa" w:w="1080"/>
+          </w:tcPr>
+          <w:p>
+            <w:r>
+              <w:t>Not Executed</w:t>
+            </w:r>
+          </w:p>
+        </w:tc>
+        <w:tc>
+          <w:tcPr>
+            <w:tcW w:type="dxa" w:w="1080"/>
+          </w:tcPr>
+          <w:p>
+            <w:r>
+              <w:t>One or more mandatory fields are blank.</w:t>
+            </w:r>
+          </w:p>
+        </w:tc>
+      </w:tr>
+      <w:tr>
+        <w:tc>
+          <w:tcPr>
+            <w:tcW w:type="dxa" w:w="1080"/>
+          </w:tcPr>
+          <w:p>
+            <w:r>
+              <w:t>TC12</w:t>
+            </w:r>
+          </w:p>
+        </w:tc>
+        <w:tc>
+          <w:tcPr>
+            <w:tcW w:type="dxa" w:w="1080"/>
+          </w:tcPr>
+          <w:p>
+            <w:r>
+              <w:t>Verify that all vehicle doors are locked successfully when the Lock button on the key fob is pressed</w:t>
+            </w:r>
+          </w:p>
+        </w:tc>
+        <w:tc>
+          <w:tcPr>
+            <w:tcW w:type="dxa" w:w="1080"/>
+          </w:tcPr>
+          <w:p>
+            <w:r>
+              <w:t>OFF</w:t>
+            </w:r>
+          </w:p>
+        </w:tc>
+        <w:tc>
+          <w:tcPr>
+            <w:tcW w:type="dxa" w:w="1080"/>
+          </w:tcPr>
+          <w:p>
+            <w:r>
+              <w:t>0</w:t>
+            </w:r>
+          </w:p>
+        </w:tc>
+        <w:tc>
+          <w:tcPr>
+            <w:tcW w:type="dxa" w:w="1080"/>
+          </w:tcPr>
+          <w:p>
+            <w:r>
+              <w:t>Door Locked</w:t>
+            </w:r>
+          </w:p>
+        </w:tc>
+        <w:tc>
+          <w:tcPr>
+            <w:tcW w:type="dxa" w:w="1080"/>
+          </w:tcPr>
+          <w:p>
+            <w:r>
+              <w:t>Door Locked</w:t>
+            </w:r>
+          </w:p>
+        </w:tc>
+        <w:tc>
+          <w:tcPr>
+            <w:tcW w:type="dxa" w:w="1080"/>
+          </w:tcPr>
+          <w:p>
+            <w:r>
+              <w:t>Pass</w:t>
+            </w:r>
+          </w:p>
+        </w:tc>
+        <w:tc>
+          <w:tcPr>
+            <w:tcW w:type="dxa" w:w="1080"/>
+          </w:tcPr>
+          <w:p>
+            <w:r>
+              <w:t>Lock Successful</w:t>
+            </w:r>
+          </w:p>
+        </w:tc>
+      </w:tr>
+      <w:tr>
+        <w:tc>
+          <w:tcPr>
+            <w:tcW w:type="dxa" w:w="1080"/>
+          </w:tcPr>
+          <w:p>
+            <w:r>
+              <w:t>TC13</w:t>
+            </w:r>
+          </w:p>
+        </w:tc>
+        <w:tc>
+          <w:tcPr>
+            <w:tcW w:type="dxa" w:w="1080"/>
+          </w:tcPr>
+          <w:p>
+            <w:r>
+              <w:t xml:space="preserve">Verify that all vehicle doors are unlocked successfully when the Unlock button on the key fob is pressed </w:t>
+            </w:r>
+          </w:p>
+        </w:tc>
+        <w:tc>
+          <w:tcPr>
+            <w:tcW w:type="dxa" w:w="1080"/>
+          </w:tcPr>
+          <w:p>
+            <w:r>
+              <w:t>OFF</w:t>
+            </w:r>
+          </w:p>
+        </w:tc>
+        <w:tc>
+          <w:tcPr>
+            <w:tcW w:type="dxa" w:w="1080"/>
+          </w:tcPr>
+          <w:p>
+            <w:r>
+              <w:t>0</w:t>
+            </w:r>
+          </w:p>
+        </w:tc>
+        <w:tc>
+          <w:tcPr>
+            <w:tcW w:type="dxa" w:w="1080"/>
           </w:tcPr>
           <w:p>
             <w:r>
@@ -710,49 +1322,7 @@
         </w:tc>
         <w:tc>
           <w:tcPr>
-            <w:tcW w:type="dxa" w:w="1440"/>
-          </w:tcPr>
-          <w:p>
-            <w:r>
-              <w:t>Fail</w:t>
-            </w:r>
-          </w:p>
-        </w:tc>
-        <w:tc>
-          <w:tcPr>
-            <w:tcW w:type="dxa" w:w="1440"/>
-          </w:tcPr>
-          <w:p>
-            <w:r>
-              <w:t>Rear Right Door Open, Central Lock Failed</w:t>
-            </w:r>
-          </w:p>
-        </w:tc>
-      </w:tr>
-      <w:tr>
-        <w:tc>
-          <w:tcPr>
-            <w:tcW w:type="dxa" w:w="1440"/>
-          </w:tcPr>
-          <w:p>
-            <w:r>
-              <w:t>TC10</w:t>
-            </w:r>
-          </w:p>
-        </w:tc>
-        <w:tc>
-          <w:tcPr>
-            <w:tcW w:type="dxa" w:w="1440"/>
-          </w:tcPr>
-          <w:p>
-            <w:r>
-              <w:t>Verify central unlock request</w:t>
-            </w:r>
-          </w:p>
-        </w:tc>
-        <w:tc>
-          <w:tcPr>
-            <w:tcW w:type="dxa" w:w="1440"/>
+            <w:tcW w:type="dxa" w:w="1080"/>
           </w:tcPr>
           <w:p>
             <w:r>
@@ -762,17 +1332,7 @@
         </w:tc>
         <w:tc>
           <w:tcPr>
-            <w:tcW w:type="dxa" w:w="1440"/>
-          </w:tcPr>
-          <w:p>
-            <w:r>
-              <w:t>Door Unlocked</w:t>
-            </w:r>
-          </w:p>
-        </w:tc>
-        <w:tc>
-          <w:tcPr>
-            <w:tcW w:type="dxa" w:w="1440"/>
+            <w:tcW w:type="dxa" w:w="1080"/>
           </w:tcPr>
           <w:p>
             <w:r>
@@ -782,73 +1342,11 @@
         </w:tc>
         <w:tc>
           <w:tcPr>
-            <w:tcW w:type="dxa" w:w="1440"/>
+            <w:tcW w:type="dxa" w:w="1080"/>
           </w:tcPr>
           <w:p>
             <w:r>
-              <w:t>Unlock Allowed</w:t>
-            </w:r>
-          </w:p>
-        </w:tc>
-      </w:tr>
-      <w:tr>
-        <w:tc>
-          <w:tcPr>
-            <w:tcW w:type="dxa" w:w="1440"/>
-          </w:tcPr>
-          <w:p>
-            <w:r>
-              <w:t>TC11</w:t>
-            </w:r>
-          </w:p>
-        </w:tc>
-        <w:tc>
-          <w:tcPr>
-            <w:tcW w:type="dxa" w:w="1440"/>
-          </w:tcPr>
-          <w:p>
-            <w:r>
-              <w:t>Verify lock request when boot door open</w:t>
-            </w:r>
-          </w:p>
-        </w:tc>
-        <w:tc>
-          <w:tcPr>
-            <w:tcW w:type="dxa" w:w="1440"/>
-          </w:tcPr>
-          <w:p>
-            <w:r>
-              <w:t>Door Unlocked</w:t>
-            </w:r>
-          </w:p>
-        </w:tc>
-        <w:tc>
-          <w:tcPr>
-            <w:tcW w:type="dxa" w:w="1440"/>
-          </w:tcPr>
-          <w:p>
-            <w:r>
-              <w:t>Door Unlocked</w:t>
-            </w:r>
-          </w:p>
-        </w:tc>
-        <w:tc>
-          <w:tcPr>
-            <w:tcW w:type="dxa" w:w="1440"/>
-          </w:tcPr>
-          <w:p>
-            <w:r>
-              <w:t>Pass</w:t>
-            </w:r>
-          </w:p>
-        </w:tc>
-        <w:tc>
-          <w:tcPr>
-            <w:tcW w:type="dxa" w:w="1440"/>
-          </w:tcPr>
-          <w:p>
-            <w:r>
-              <w:t>Boot Door Open, Lock Failed</w:t>
+              <w:t>Unlock Successful</w:t>
             </w:r>
           </w:p>
         </w:tc>
@@ -869,12 +1367,12 @@
     </w:p>
     <w:p>
       <w:r>
-        <w:t>TC03 : Unlock Allowed</w:t>
+        <w:t>TC06 : Speed Below Auto Lock Threshold</w:t>
       </w:r>
     </w:p>
     <w:p>
       <w:r>
-        <w:t>TC09 : Rear Right Door Open, Central Lock Failed</w:t>
+        <w:t>TC08 : Driver Door Open, Central Lock Failed</w:t>
       </w:r>
     </w:p>
     <w:p>
@@ -887,15 +1385,18 @@
     </w:p>
     <w:p>
       <w:r>
-        <w:t>A total of 11 test cases were executed.</w:t>
+        <w:t>A total of 14 test cases were executed.</w:t>
         <w:br/>
         <w:br/>
-        <w:t>8 test cases passed.</w:t>
+        <w:t>9 test cases passed.</w:t>
         <w:br/>
         <w:t>3 test cases failed.</w:t>
         <w:br/>
         <w:br/>
-        <w:t>Pass Percentage : 72.73%</w:t>
+        <w:t xml:space="preserve">2 test cases not executed. </w:t>
+        <w:br/>
+        <w:br/>
+        <w:t>Pass Percentage : 64.29%</w:t>
       </w:r>
     </w:p>
     <w:sectPr>

</xml_diff>